<commit_message>
Finalize paper and curriculum updates
</commit_message>
<xml_diff>
--- a/paper/_output/crosshairs-audit-paper.docx
+++ b/paper/_output/crosshairs-audit-paper.docx
@@ -2896,7 +2896,7 @@
             <w:r>
               <w:drawing>
                 <wp:inline>
-                  <wp:extent cx="5334000" cy="914194"/>
+                  <wp:extent cx="5334000" cy="971781"/>
                   <wp:effectExtent b="0" l="0" r="0" t="0"/>
                   <wp:docPr descr="" title="" id="31" name="Picture"/>
                   <a:graphic>
@@ -2917,7 +2917,7 @@
                         <pic:spPr bwMode="auto">
                           <a:xfrm>
                             <a:off x="0" y="0"/>
-                            <a:ext cx="5334000" cy="914194"/>
+                            <a:ext cx="5334000" cy="971781"/>
                           </a:xfrm>
                           <a:prstGeom prst="rect">
                             <a:avLst/>
@@ -4248,7 +4248,7 @@
       </w:r>
     </w:p>
     <w:bookmarkEnd w:id="48"/>
-    <w:bookmarkStart w:id="112" w:name="appendix-tool-resource-guide"/>
+    <w:bookmarkStart w:id="80" w:name="appendix-tool-resource-guide"/>
     <w:p>
       <w:pPr>
         <w:pStyle w:val="Heading1"/>
@@ -4656,14 +4656,9 @@
       <w:r>
         <w:t xml:space="preserve">— calibrates the gap between confidence and perceived support.</w:t>
       </w:r>
-    </w:p>
-    <w:p>
-      <w:pPr>
-        <w:numPr>
-          <w:ilvl w:val="0"/>
-          <w:numId w:val="1000"/>
-        </w:numPr>
-      </w:pPr>
+      <w:r>
+        <w:br/>
+      </w:r>
       <w:r>
         <w:t xml:space="preserve">—</w:t>
       </w:r>
@@ -4678,14 +4673,9 @@
           <w:t xml:space="preserve">Manual</w:t>
         </w:r>
       </w:hyperlink>
-    </w:p>
-    <w:p>
-      <w:pPr>
-        <w:numPr>
-          <w:ilvl w:val="0"/>
-          <w:numId w:val="1000"/>
-        </w:numPr>
-      </w:pPr>
+      <w:r>
+        <w:br/>
+      </w:r>
       <w:r>
         <w:t xml:space="preserve">—</w:t>
       </w:r>
@@ -4722,14 +4712,9 @@
       <w:r>
         <w:t xml:space="preserve">— checks whether fine-tuning really licenses design, purpose, or theism.</w:t>
       </w:r>
-    </w:p>
-    <w:p>
-      <w:pPr>
-        <w:numPr>
-          <w:ilvl w:val="0"/>
-          <w:numId w:val="1000"/>
-        </w:numPr>
-      </w:pPr>
+      <w:r>
+        <w:br/>
+      </w:r>
       <w:r>
         <w:t xml:space="preserve">—</w:t>
       </w:r>
@@ -4744,14 +4729,9 @@
           <w:t xml:space="preserve">Manual</w:t>
         </w:r>
       </w:hyperlink>
-    </w:p>
-    <w:p>
-      <w:pPr>
-        <w:numPr>
-          <w:ilvl w:val="0"/>
-          <w:numId w:val="1000"/>
-        </w:numPr>
-      </w:pPr>
+      <w:r>
+        <w:br/>
+      </w:r>
       <w:r>
         <w:t xml:space="preserve">—</w:t>
       </w:r>
@@ -4788,14 +4768,9 @@
       <w:r>
         <w:t xml:space="preserve">— tests whether earthly divine-promise claims remain open to ordinary verification.</w:t>
       </w:r>
-    </w:p>
-    <w:p>
-      <w:pPr>
-        <w:numPr>
-          <w:ilvl w:val="0"/>
-          <w:numId w:val="1000"/>
-        </w:numPr>
-      </w:pPr>
+      <w:r>
+        <w:br/>
+      </w:r>
       <w:r>
         <w:t xml:space="preserve">—</w:t>
       </w:r>
@@ -4810,14 +4785,9 @@
           <w:t xml:space="preserve">Manual</w:t>
         </w:r>
       </w:hyperlink>
-    </w:p>
-    <w:p>
-      <w:pPr>
-        <w:numPr>
-          <w:ilvl w:val="0"/>
-          <w:numId w:val="1000"/>
-        </w:numPr>
-      </w:pPr>
+      <w:r>
+        <w:br/>
+      </w:r>
       <w:r>
         <w:t xml:space="preserve">—</w:t>
       </w:r>
@@ -4854,14 +4824,9 @@
       <w:r>
         <w:t xml:space="preserve">— compares whether similar patterns are judged fairly across favored and unfavored cases.</w:t>
       </w:r>
-    </w:p>
-    <w:p>
-      <w:pPr>
-        <w:numPr>
-          <w:ilvl w:val="0"/>
-          <w:numId w:val="1000"/>
-        </w:numPr>
-      </w:pPr>
+      <w:r>
+        <w:br/>
+      </w:r>
       <w:r>
         <w:t xml:space="preserve">—</w:t>
       </w:r>
@@ -4876,14 +4841,9 @@
           <w:t xml:space="preserve">Manual</w:t>
         </w:r>
       </w:hyperlink>
-    </w:p>
-    <w:p>
-      <w:pPr>
-        <w:numPr>
-          <w:ilvl w:val="0"/>
-          <w:numId w:val="1000"/>
-        </w:numPr>
-      </w:pPr>
+      <w:r>
+        <w:br/>
+      </w:r>
       <w:r>
         <w:t xml:space="preserve">—</w:t>
       </w:r>
@@ -4920,14 +4880,9 @@
       <w:r>
         <w:t xml:space="preserve">— makes miracle and resurrection reasoning explicit through structured evidential accounting.</w:t>
       </w:r>
-    </w:p>
-    <w:p>
-      <w:pPr>
-        <w:numPr>
-          <w:ilvl w:val="0"/>
-          <w:numId w:val="1000"/>
-        </w:numPr>
-      </w:pPr>
+      <w:r>
+        <w:br/>
+      </w:r>
       <w:r>
         <w:t xml:space="preserve">—</w:t>
       </w:r>
@@ -4942,14 +4897,9 @@
           <w:t xml:space="preserve">Manual</w:t>
         </w:r>
       </w:hyperlink>
-    </w:p>
-    <w:p>
-      <w:pPr>
-        <w:numPr>
-          <w:ilvl w:val="0"/>
-          <w:numId w:val="1000"/>
-        </w:numPr>
-      </w:pPr>
+      <w:r>
+        <w:br/>
+      </w:r>
       <w:r>
         <w:t xml:space="preserve">—</w:t>
       </w:r>
@@ -4986,14 +4936,9 @@
       <w:r>
         <w:t xml:space="preserve">— asks whether a full enough moral system exists to support strong truth claims.</w:t>
       </w:r>
-    </w:p>
-    <w:p>
-      <w:pPr>
-        <w:numPr>
-          <w:ilvl w:val="0"/>
-          <w:numId w:val="1000"/>
-        </w:numPr>
-      </w:pPr>
+      <w:r>
+        <w:br/>
+      </w:r>
       <w:r>
         <w:t xml:space="preserve">—</w:t>
       </w:r>
@@ -5008,14 +4953,9 @@
           <w:t xml:space="preserve">Manual</w:t>
         </w:r>
       </w:hyperlink>
-    </w:p>
-    <w:p>
-      <w:pPr>
-        <w:numPr>
-          <w:ilvl w:val="0"/>
-          <w:numId w:val="1000"/>
-        </w:numPr>
-      </w:pPr>
+      <w:r>
+        <w:br/>
+      </w:r>
       <w:r>
         <w:t xml:space="preserve">—</w:t>
       </w:r>
@@ -5052,14 +4992,9 @@
       <w:r>
         <w:t xml:space="preserve">— pressure-tests the user’s moral framework for authority, consistency, and substantiation.</w:t>
       </w:r>
-    </w:p>
-    <w:p>
-      <w:pPr>
-        <w:numPr>
-          <w:ilvl w:val="0"/>
-          <w:numId w:val="1000"/>
-        </w:numPr>
-      </w:pPr>
+      <w:r>
+        <w:br/>
+      </w:r>
       <w:r>
         <w:t xml:space="preserve">—</w:t>
       </w:r>
@@ -5074,14 +5009,9 @@
           <w:t xml:space="preserve">Manual</w:t>
         </w:r>
       </w:hyperlink>
-    </w:p>
-    <w:p>
-      <w:pPr>
-        <w:numPr>
-          <w:ilvl w:val="0"/>
-          <w:numId w:val="1000"/>
-        </w:numPr>
-      </w:pPr>
+      <w:r>
+        <w:br/>
+      </w:r>
       <w:r>
         <w:t xml:space="preserve">—</w:t>
       </w:r>
@@ -5118,14 +5048,9 @@
       <w:r>
         <w:t xml:space="preserve">— checks whether concrete moral judgments remain consistent across cases and grounders.</w:t>
       </w:r>
-    </w:p>
-    <w:p>
-      <w:pPr>
-        <w:numPr>
-          <w:ilvl w:val="0"/>
-          <w:numId w:val="1000"/>
-        </w:numPr>
-      </w:pPr>
+      <w:r>
+        <w:br/>
+      </w:r>
       <w:r>
         <w:t xml:space="preserve">—</w:t>
       </w:r>
@@ -5140,14 +5065,9 @@
           <w:t xml:space="preserve">Manual</w:t>
         </w:r>
       </w:hyperlink>
-    </w:p>
-    <w:p>
-      <w:pPr>
-        <w:numPr>
-          <w:ilvl w:val="0"/>
-          <w:numId w:val="1000"/>
-        </w:numPr>
-      </w:pPr>
+      <w:r>
+        <w:br/>
+      </w:r>
       <w:r>
         <w:t xml:space="preserve">—</w:t>
       </w:r>
@@ -5184,14 +5104,9 @@
       <w:r>
         <w:t xml:space="preserve">— maps how thin design inferences are thickened into broader theistic and Christian claims.</w:t>
       </w:r>
-    </w:p>
-    <w:p>
-      <w:pPr>
-        <w:numPr>
-          <w:ilvl w:val="0"/>
-          <w:numId w:val="1000"/>
-        </w:numPr>
-      </w:pPr>
+      <w:r>
+        <w:br/>
+      </w:r>
       <w:r>
         <w:t xml:space="preserve">—</w:t>
       </w:r>
@@ -5206,14 +5121,9 @@
           <w:t xml:space="preserve">Manual</w:t>
         </w:r>
       </w:hyperlink>
-    </w:p>
-    <w:p>
-      <w:pPr>
-        <w:numPr>
-          <w:ilvl w:val="0"/>
-          <w:numId w:val="1000"/>
-        </w:numPr>
-      </w:pPr>
+      <w:r>
+        <w:br/>
+      </w:r>
       <w:r>
         <w:t xml:space="preserve">—</w:t>
       </w:r>
@@ -5229,8 +5139,18 @@
         </w:r>
       </w:hyperlink>
     </w:p>
-    <w:bookmarkStart w:id="111" w:name="refs"/>
-    <w:bookmarkStart w:id="80" w:name="ref-alston1991"/>
+    <w:bookmarkEnd w:id="80"/>
+    <w:bookmarkStart w:id="113" w:name="references"/>
+    <w:p>
+      <w:pPr>
+        <w:pStyle w:val="Heading1"/>
+      </w:pPr>
+      <w:r>
+        <w:t xml:space="preserve">References</w:t>
+      </w:r>
+    </w:p>
+    <w:bookmarkStart w:id="112" w:name="refs"/>
+    <w:bookmarkStart w:id="81" w:name="ref-alston1991"/>
     <w:p>
       <w:pPr>
         <w:pStyle w:val="Bibliography"/>
@@ -5252,8 +5172,8 @@
         <w:t xml:space="preserve">. Cornell University Press.</w:t>
       </w:r>
     </w:p>
-    <w:bookmarkEnd w:id="80"/>
-    <w:bookmarkStart w:id="82" w:name="ref-batson1975"/>
+    <w:bookmarkEnd w:id="81"/>
+    <w:bookmarkStart w:id="83" w:name="ref-batson1975"/>
     <w:p>
       <w:pPr>
         <w:pStyle w:val="Bibliography"/>
@@ -5286,7 +5206,7 @@
       <w:r>
         <w:t xml:space="preserve"> </w:t>
       </w:r>
-      <w:hyperlink r:id="rId81">
+      <w:hyperlink r:id="rId82">
         <w:r>
           <w:rPr>
             <w:rStyle w:val="Hyperlink"/>
@@ -5298,8 +5218,8 @@
         <w:t xml:space="preserve">.</w:t>
       </w:r>
     </w:p>
-    <w:bookmarkEnd w:id="82"/>
-    <w:bookmarkStart w:id="84" w:name="ref-batsonschoenrade1991"/>
+    <w:bookmarkEnd w:id="83"/>
+    <w:bookmarkStart w:id="85" w:name="ref-batsonschoenrade1991"/>
     <w:p>
       <w:pPr>
         <w:pStyle w:val="Bibliography"/>
@@ -5332,7 +5252,7 @@
       <w:r>
         <w:t xml:space="preserve"> </w:t>
       </w:r>
-      <w:hyperlink r:id="rId83">
+      <w:hyperlink r:id="rId84">
         <w:r>
           <w:rPr>
             <w:rStyle w:val="Hyperlink"/>
@@ -5344,8 +5264,8 @@
         <w:t xml:space="preserve">.</w:t>
       </w:r>
     </w:p>
-    <w:bookmarkEnd w:id="84"/>
-    <w:bookmarkStart w:id="86" w:name="ref-chinn2011"/>
+    <w:bookmarkEnd w:id="85"/>
+    <w:bookmarkStart w:id="87" w:name="ref-chinn2011"/>
     <w:p>
       <w:pPr>
         <w:pStyle w:val="Bibliography"/>
@@ -5378,7 +5298,7 @@
       <w:r>
         <w:t xml:space="preserve"> </w:t>
       </w:r>
-      <w:hyperlink r:id="rId85">
+      <w:hyperlink r:id="rId86">
         <w:r>
           <w:rPr>
             <w:rStyle w:val="Hyperlink"/>
@@ -5390,8 +5310,8 @@
         <w:t xml:space="preserve">.</w:t>
       </w:r>
     </w:p>
-    <w:bookmarkEnd w:id="86"/>
-    <w:bookmarkStart w:id="87" w:name="ref-festinger1957"/>
+    <w:bookmarkEnd w:id="87"/>
+    <w:bookmarkStart w:id="88" w:name="ref-festinger1957"/>
     <w:p>
       <w:pPr>
         <w:pStyle w:val="Bibliography"/>
@@ -5413,8 +5333,8 @@
         <w:t xml:space="preserve">. Stanford University Press.</w:t>
       </w:r>
     </w:p>
-    <w:bookmarkEnd w:id="87"/>
-    <w:bookmarkStart w:id="89" w:name="ref-hoferpintrich1997"/>
+    <w:bookmarkEnd w:id="88"/>
+    <w:bookmarkStart w:id="90" w:name="ref-hoferpintrich1997"/>
     <w:p>
       <w:pPr>
         <w:pStyle w:val="Bibliography"/>
@@ -5447,7 +5367,7 @@
       <w:r>
         <w:t xml:space="preserve"> </w:t>
       </w:r>
-      <w:hyperlink r:id="rId88">
+      <w:hyperlink r:id="rId89">
         <w:r>
           <w:rPr>
             <w:rStyle w:val="Hyperlink"/>
@@ -5459,8 +5379,8 @@
         <w:t xml:space="preserve">.</w:t>
       </w:r>
     </w:p>
-    <w:bookmarkEnd w:id="89"/>
-    <w:bookmarkStart w:id="91" w:name="ref-kahan2017"/>
+    <w:bookmarkEnd w:id="90"/>
+    <w:bookmarkStart w:id="92" w:name="ref-kahan2017"/>
     <w:p>
       <w:pPr>
         <w:pStyle w:val="Bibliography"/>
@@ -5493,7 +5413,7 @@
       <w:r>
         <w:t xml:space="preserve"> </w:t>
       </w:r>
-      <w:hyperlink r:id="rId90">
+      <w:hyperlink r:id="rId91">
         <w:r>
           <w:rPr>
             <w:rStyle w:val="Hyperlink"/>
@@ -5505,8 +5425,8 @@
         <w:t xml:space="preserve">.</w:t>
       </w:r>
     </w:p>
-    <w:bookmarkEnd w:id="91"/>
-    <w:bookmarkStart w:id="93" w:name="ref-kunda1990"/>
+    <w:bookmarkEnd w:id="92"/>
+    <w:bookmarkStart w:id="94" w:name="ref-kunda1990"/>
     <w:p>
       <w:pPr>
         <w:pStyle w:val="Bibliography"/>
@@ -5539,7 +5459,7 @@
       <w:r>
         <w:t xml:space="preserve"> </w:t>
       </w:r>
-      <w:hyperlink r:id="rId92">
+      <w:hyperlink r:id="rId93">
         <w:r>
           <w:rPr>
             <w:rStyle w:val="Hyperlink"/>
@@ -5551,8 +5471,8 @@
         <w:t xml:space="preserve">.</w:t>
       </w:r>
     </w:p>
-    <w:bookmarkEnd w:id="93"/>
-    <w:bookmarkStart w:id="95" w:name="ref-mcfarlandwarren1992"/>
+    <w:bookmarkEnd w:id="94"/>
+    <w:bookmarkStart w:id="96" w:name="ref-mcfarlandwarren1992"/>
     <w:p>
       <w:pPr>
         <w:pStyle w:val="Bibliography"/>
@@ -5585,7 +5505,7 @@
       <w:r>
         <w:t xml:space="preserve"> </w:t>
       </w:r>
-      <w:hyperlink r:id="rId94">
+      <w:hyperlink r:id="rId95">
         <w:r>
           <w:rPr>
             <w:rStyle w:val="Hyperlink"/>
@@ -5597,8 +5517,8 @@
         <w:t xml:space="preserve">.</w:t>
       </w:r>
     </w:p>
-    <w:bookmarkEnd w:id="95"/>
-    <w:bookmarkStart w:id="97" w:name="ref-merciersperber2011"/>
+    <w:bookmarkEnd w:id="96"/>
+    <w:bookmarkStart w:id="98" w:name="ref-merciersperber2011"/>
     <w:p>
       <w:pPr>
         <w:pStyle w:val="Bibliography"/>
@@ -5631,7 +5551,7 @@
       <w:r>
         <w:t xml:space="preserve"> </w:t>
       </w:r>
-      <w:hyperlink r:id="rId96">
+      <w:hyperlink r:id="rId97">
         <w:r>
           <w:rPr>
             <w:rStyle w:val="Hyperlink"/>
@@ -5643,8 +5563,8 @@
         <w:t xml:space="preserve">.</w:t>
       </w:r>
     </w:p>
-    <w:bookmarkEnd w:id="97"/>
-    <w:bookmarkStart w:id="99" w:name="ref-moorehealy2008"/>
+    <w:bookmarkEnd w:id="98"/>
+    <w:bookmarkStart w:id="100" w:name="ref-moorehealy2008"/>
     <w:p>
       <w:pPr>
         <w:pStyle w:val="Bibliography"/>
@@ -5677,7 +5597,7 @@
       <w:r>
         <w:t xml:space="preserve"> </w:t>
       </w:r>
-      <w:hyperlink r:id="rId98">
+      <w:hyperlink r:id="rId99">
         <w:r>
           <w:rPr>
             <w:rStyle w:val="Hyperlink"/>
@@ -5689,8 +5609,8 @@
         <w:t xml:space="preserve">.</w:t>
       </w:r>
     </w:p>
-    <w:bookmarkEnd w:id="99"/>
-    <w:bookmarkStart w:id="101" w:name="ref-pintrich1993"/>
+    <w:bookmarkEnd w:id="100"/>
+    <w:bookmarkStart w:id="102" w:name="ref-pintrich1993"/>
     <w:p>
       <w:pPr>
         <w:pStyle w:val="Bibliography"/>
@@ -5723,7 +5643,7 @@
       <w:r>
         <w:t xml:space="preserve"> </w:t>
       </w:r>
-      <w:hyperlink r:id="rId100">
+      <w:hyperlink r:id="rId101">
         <w:r>
           <w:rPr>
             <w:rStyle w:val="Hyperlink"/>
@@ -5735,8 +5655,8 @@
         <w:t xml:space="preserve">.</w:t>
       </w:r>
     </w:p>
-    <w:bookmarkEnd w:id="101"/>
-    <w:bookmarkStart w:id="102" w:name="ref-plantinga2000"/>
+    <w:bookmarkEnd w:id="102"/>
+    <w:bookmarkStart w:id="103" w:name="ref-plantinga2000"/>
     <w:p>
       <w:pPr>
         <w:pStyle w:val="Bibliography"/>
@@ -5758,8 +5678,8 @@
         <w:t xml:space="preserve">. Oxford University Press.</w:t>
       </w:r>
     </w:p>
-    <w:bookmarkEnd w:id="102"/>
-    <w:bookmarkStart w:id="104" w:name="ref-posner1982"/>
+    <w:bookmarkEnd w:id="103"/>
+    <w:bookmarkStart w:id="105" w:name="ref-posner1982"/>
     <w:p>
       <w:pPr>
         <w:pStyle w:val="Bibliography"/>
@@ -5792,7 +5712,7 @@
       <w:r>
         <w:t xml:space="preserve"> </w:t>
       </w:r>
-      <w:hyperlink r:id="rId103">
+      <w:hyperlink r:id="rId104">
         <w:r>
           <w:rPr>
             <w:rStyle w:val="Hyperlink"/>
@@ -5804,8 +5724,8 @@
         <w:t xml:space="preserve">.</w:t>
       </w:r>
     </w:p>
-    <w:bookmarkEnd w:id="104"/>
-    <w:bookmarkStart w:id="106" w:name="ref-sandoval2016"/>
+    <w:bookmarkEnd w:id="105"/>
+    <w:bookmarkStart w:id="107" w:name="ref-sandoval2016"/>
     <w:p>
       <w:pPr>
         <w:pStyle w:val="Bibliography"/>
@@ -5838,7 +5758,7 @@
       <w:r>
         <w:t xml:space="preserve"> </w:t>
       </w:r>
-      <w:hyperlink r:id="rId105">
+      <w:hyperlink r:id="rId106">
         <w:r>
           <w:rPr>
             <w:rStyle w:val="Hyperlink"/>
@@ -5850,8 +5770,8 @@
         <w:t xml:space="preserve">.</w:t>
       </w:r>
     </w:p>
-    <w:bookmarkEnd w:id="106"/>
-    <w:bookmarkStart w:id="107" w:name="ref-swinburne2003"/>
+    <w:bookmarkEnd w:id="107"/>
+    <w:bookmarkStart w:id="108" w:name="ref-swinburne2003"/>
     <w:p>
       <w:pPr>
         <w:pStyle w:val="Bibliography"/>
@@ -5873,8 +5793,8 @@
         <w:t xml:space="preserve">. Oxford University Press.</w:t>
       </w:r>
     </w:p>
-    <w:bookmarkEnd w:id="107"/>
-    <w:bookmarkStart w:id="108" w:name="ref-swinburne2004"/>
+    <w:bookmarkEnd w:id="108"/>
+    <w:bookmarkStart w:id="109" w:name="ref-swinburne2004"/>
     <w:p>
       <w:pPr>
         <w:pStyle w:val="Bibliography"/>
@@ -5896,8 +5816,8 @@
         <w:t xml:space="preserve">. 2nd ed. Oxford University Press.</w:t>
       </w:r>
     </w:p>
-    <w:bookmarkEnd w:id="108"/>
-    <w:bookmarkStart w:id="110" w:name="ref-wood1976"/>
+    <w:bookmarkEnd w:id="109"/>
+    <w:bookmarkStart w:id="111" w:name="ref-wood1976"/>
     <w:p>
       <w:pPr>
         <w:pStyle w:val="Bibliography"/>
@@ -5930,7 +5850,7 @@
       <w:r>
         <w:t xml:space="preserve"> </w:t>
       </w:r>
-      <w:hyperlink r:id="rId109">
+      <w:hyperlink r:id="rId110">
         <w:r>
           <w:rPr>
             <w:rStyle w:val="Hyperlink"/>
@@ -5942,9 +5862,9 @@
         <w:t xml:space="preserve">.</w:t>
       </w:r>
     </w:p>
-    <w:bookmarkEnd w:id="110"/>
     <w:bookmarkEnd w:id="111"/>
     <w:bookmarkEnd w:id="112"/>
+    <w:bookmarkEnd w:id="113"/>
     <w:sectPr>
       <w:footnotePr>
         <w:numRestart w:val="eachSect"/>

</xml_diff>